<commit_message>
AGB 2.0, Ausfallvergütung mit Vorbereitung und Protokoll, Widerrufsfunktion
- AGB Version 2.0 mit zentraler Konfiguration (lib/legal/terms.js), Archiv /agb/v1
- Versäumter Termin: 50 % Stundenpreis plus halbe Vorbereitungszeit (15/25 € je Stunde),
  Drawer-Dialog, Rechnungszeilen, Ausfallprotokoll
- Widerrufsfunktion (§ 356a BGB) mit Eingangsbestätigung, AGB-Fassung je Buchung/Rechnung
- Absageregel auf Angebots- und Buchungsseite, FAQ angeglichen, AGB bei Telefonbuchung

Co-Authored-By: Claude Sonnet 5.5 <noreply@anthropic.com>
</commit_message>
<xml_diff>
--- a/docs/papierakte/referenz/Lernsprung_Papierakte_leer.docx
+++ b/docs/papierakte/referenz/Lernsprung_Papierakte_leer.docx
@@ -3602,7 +3602,7 @@
                 <w:sz w:val="18"/>
                 <w:szCs w:val="18"/>
               </w:rPr>
-              <w:t xml:space="preserve">  AGB, Widerrufsbelehrung und Datenschutzhinweise per E-Mail geschickt</w:t>
+              <w:t xml:space="preserve">  AGB (Version 2.0), Widerrufsbelehrung und Datenschutzhinweise per E-Mail geschickt am ____________</w:t>
             </w:r>
           </w:p>
           <w:p>
@@ -3648,7 +3648,43 @@
                 <w:sz w:val="18"/>
                 <w:szCs w:val="18"/>
               </w:rPr>
-              <w:t xml:space="preserve">  Unterricht soll vor Ablauf der 14-tägigen Widerrufsfrist beginnen: Wunsch vom Kunden per E-Mail bestätigt</w:t>
+              <w:t xml:space="preserve">  Vorzeitiger Beginn vor Ablauf der 14-Tage-Widerrufsfrist:  </w:t>
+            </w:r>
+            <w:r>
+              <w:rPr>
+                <w:rFonts w:ascii="Segoe UI Symbol" w:cs="Segoe UI Symbol" w:eastAsia="Segoe UI Symbol" w:hAnsi="Segoe UI Symbol"/>
+                <w:color w:val="0C4B68"/>
+                <w:sz w:val="22"/>
+                <w:szCs w:val="22"/>
+              </w:rPr>
+              <w:t xml:space="preserve">☐</w:t>
+            </w:r>
+            <w:r>
+              <w:rPr>
+                <w:rFonts w:ascii="Arial" w:cs="Arial" w:eastAsia="Arial" w:hAnsi="Arial"/>
+                <w:color w:val="1F2A36"/>
+                <w:sz w:val="18"/>
+                <w:szCs w:val="18"/>
+              </w:rPr>
+              <w:t xml:space="preserve"> ja   </w:t>
+            </w:r>
+            <w:r>
+              <w:rPr>
+                <w:rFonts w:ascii="Segoe UI Symbol" w:cs="Segoe UI Symbol" w:eastAsia="Segoe UI Symbol" w:hAnsi="Segoe UI Symbol"/>
+                <w:color w:val="0C4B68"/>
+                <w:sz w:val="22"/>
+                <w:szCs w:val="22"/>
+              </w:rPr>
+              <w:t xml:space="preserve">☐</w:t>
+            </w:r>
+            <w:r>
+              <w:rPr>
+                <w:rFonts w:ascii="Arial" w:cs="Arial" w:eastAsia="Arial" w:hAnsi="Arial"/>
+                <w:color w:val="1F2A36"/>
+                <w:sz w:val="18"/>
+                <w:szCs w:val="18"/>
+              </w:rPr>
+              <w:t xml:space="preserve"> nein (per E-Mail bestätigt)</w:t>
             </w:r>
           </w:p>
           <w:p>
@@ -3694,7 +3730,7 @@
                 <w:sz w:val="18"/>
                 <w:szCs w:val="18"/>
               </w:rPr>
-              <w:t xml:space="preserve">  Absageregelung nach AGB erklärt</w:t>
+              <w:t xml:space="preserve">  Absageregelung nach AGB erklärt (24 Std. kostenfrei; danach 50 % plus Vorbereitung)</w:t>
             </w:r>
           </w:p>
         </w:tc>

</xml_diff>